<commit_message>
Split multi-step commands into separate lines, add block diagram to README
</commit_message>
<xml_diff>
--- a/AD_DC_Lab_Merged_Final.docx
+++ b/AD_DC_Lab_Merged_Final.docx
@@ -487,8 +487,27 @@
           <w:sz w:val="19"/>
           <w:szCs w:val="19"/>
         </w:rPr>
-        <w:t xml:space="preserve">brew update
-brew install azure-cli</w:t>
+        <w:t xml:space="preserve">brew update</w:t>
+      </w:r>
+    </w:p>
+    <w:p>
+      <w:pPr>
+        <w:pBdr>
+          <w:top w:val="single" w:color="CCCCCC" w:sz="4"/>
+          <w:bottom w:val="single" w:color="CCCCCC" w:sz="4"/>
+          <w:left w:val="single" w:color="CCCCCC" w:sz="4"/>
+          <w:right w:val="single" w:color="CCCCCC" w:sz="4"/>
+        </w:pBdr>
+        <w:shd w:fill="F2F2F2" w:val="clear"/>
+        <w:spacing w:after="120"/>
+      </w:pPr>
+      <w:r>
+        <w:rPr>
+          <w:rFonts w:ascii="Consolas" w:cs="Consolas" w:eastAsia="Consolas" w:hAnsi="Consolas"/>
+          <w:sz w:val="19"/>
+          <w:szCs w:val="19"/>
+        </w:rPr>
+        <w:t xml:space="preserve">brew install azure-cli</w:t>
       </w:r>
     </w:p>
     <w:p>
@@ -1244,16 +1263,7 @@
           <w:sz w:val="19"/>
           <w:szCs w:val="19"/>
         </w:rPr>
-        <w:t xml:space="preserve">brew tap hashicorp/tap
-brew install hashicorp/tap/terraform</w:t>
-      </w:r>
-    </w:p>
-    <w:p>
-      <w:pPr>
-        <w:spacing w:after="120"/>
-      </w:pPr>
-      <w:r>
-        <w:t xml:space="preserve">3. Confirm it installed by typing:</w:t>
+        <w:t xml:space="preserve">brew tap hashicorp/tap</w:t>
       </w:r>
     </w:p>
     <w:p>
@@ -1273,32 +1283,15 @@
           <w:sz w:val="19"/>
           <w:szCs w:val="19"/>
         </w:rPr>
-        <w:t xml:space="preserve">terraform -version</w:t>
-      </w:r>
-    </w:p>
-    <w:p>
-      <w:pPr>
-        <w:pStyle w:val="Heading3"/>
-        <w:spacing w:after="100" w:before="180"/>
-      </w:pPr>
-      <w:r>
-        <w:t xml:space="preserve">If you use Linux</w:t>
-      </w:r>
-    </w:p>
-    <w:p>
-      <w:pPr>
-        <w:spacing w:after="120"/>
-      </w:pPr>
-      <w:r>
-        <w:t xml:space="preserve">1. Open your terminal.</w:t>
-      </w:r>
-    </w:p>
-    <w:p>
-      <w:pPr>
-        <w:spacing w:after="120"/>
-      </w:pPr>
-      <w:r>
-        <w:t xml:space="preserve">2. On Ubuntu or Debian, paste these lines one at a time. They add HashiCorp's official software source, then install Terraform from it:</w:t>
+        <w:t xml:space="preserve">brew install hashicorp/tap/terraform</w:t>
+      </w:r>
+    </w:p>
+    <w:p>
+      <w:pPr>
+        <w:spacing w:after="120"/>
+      </w:pPr>
+      <w:r>
+        <w:t xml:space="preserve">3. Confirm it installed by typing:</w:t>
       </w:r>
     </w:p>
     <w:p>
@@ -1318,17 +1311,32 @@
           <w:sz w:val="19"/>
           <w:szCs w:val="19"/>
         </w:rPr>
-        <w:t xml:space="preserve">wget -O- https://apt.releases.hashicorp.com/gpg | gpg --dearmor | sudo tee /usr/share/keyrings/hashicorp-archive-keyring.gpg
-echo "deb [signed-by=/usr/share/keyrings/hashicorp-archive-keyring.gpg] https://apt.releases.hashicorp.com $(lsb_release -cs) main" | sudo tee /etc/apt/sources.list.d/hashicorp.list
-sudo apt update &amp;&amp; sudo apt install terraform</w:t>
-      </w:r>
-    </w:p>
-    <w:p>
-      <w:pPr>
-        <w:spacing w:after="120"/>
-      </w:pPr>
-      <w:r>
-        <w:t xml:space="preserve">3. Confirm it installed by typing:</w:t>
+        <w:t xml:space="preserve">terraform -version</w:t>
+      </w:r>
+    </w:p>
+    <w:p>
+      <w:pPr>
+        <w:pStyle w:val="Heading3"/>
+        <w:spacing w:after="100" w:before="180"/>
+      </w:pPr>
+      <w:r>
+        <w:t xml:space="preserve">If you use Linux</w:t>
+      </w:r>
+    </w:p>
+    <w:p>
+      <w:pPr>
+        <w:spacing w:after="120"/>
+      </w:pPr>
+      <w:r>
+        <w:t xml:space="preserve">1. Open your terminal.</w:t>
+      </w:r>
+    </w:p>
+    <w:p>
+      <w:pPr>
+        <w:spacing w:after="120"/>
+      </w:pPr>
+      <w:r>
+        <w:t xml:space="preserve">2. On Ubuntu or Debian, paste these lines one at a time. They add HashiCorp's official software source, then install Terraform from it:</w:t>
       </w:r>
     </w:p>
     <w:p>
@@ -1348,82 +1356,7 @@
           <w:sz w:val="19"/>
           <w:szCs w:val="19"/>
         </w:rPr>
-        <w:t xml:space="preserve">terraform -version</w:t>
-      </w:r>
-    </w:p>
-    <w:p>
-      <w:pPr>
-        <w:pBdr>
-          <w:top w:val="single" w:color="F0DBA0" w:sz="4"/>
-          <w:left w:val="single" w:color="F0DBA0" w:sz="4"/>
-          <w:right w:val="single" w:color="F0DBA0" w:sz="4"/>
-        </w:pBdr>
-        <w:shd w:fill="FFF6DC" w:val="clear"/>
-        <w:spacing w:after="80"/>
-      </w:pPr>
-      <w:r>
-        <w:rPr>
-          <w:b/>
-          <w:bCs/>
-          <w:color w:val="7A5B00"/>
-          <w:sz w:val="20"/>
-          <w:szCs w:val="20"/>
-        </w:rPr>
-        <w:t xml:space="preserve">What this actually means:</w:t>
-      </w:r>
-    </w:p>
-    <w:p>
-      <w:pPr>
-        <w:pBdr>
-          <w:left w:val="single" w:color="F0DBA0" w:sz="4"/>
-          <w:right w:val="single" w:color="F0DBA0" w:sz="4"/>
-        </w:pBdr>
-        <w:shd w:fill="FFF6DC" w:val="clear"/>
-        <w:spacing w:after="60"/>
-        <w:ind w:left="288"/>
-      </w:pPr>
-      <w:r>
-        <w:rPr>
-          <w:sz w:val="20"/>
-          <w:szCs w:val="20"/>
-        </w:rPr>
-        <w:t xml:space="preserve">• The number that prints after terraform -version needs to say 1.3 or higher. If it shows something older, revisit the install steps above and make sure you grabbed the current download.</w:t>
-      </w:r>
-    </w:p>
-    <w:p>
-      <w:pPr>
-        <w:pBdr>
-          <w:bottom w:val="single" w:color="F0DBA0" w:sz="4"/>
-          <w:left w:val="single" w:color="F0DBA0" w:sz="4"/>
-          <w:right w:val="single" w:color="F0DBA0" w:sz="4"/>
-        </w:pBdr>
-        <w:shd w:fill="FFF6DC" w:val="clear"/>
-        <w:spacing w:after="120"/>
-        <w:ind w:left="288"/>
-      </w:pPr>
-      <w:r>
-        <w:rPr>
-          <w:sz w:val="20"/>
-          <w:szCs w:val="20"/>
-        </w:rPr>
-        <w:t xml:space="preserve">• Terraform itself does not talk to Azure directly. It uses the sign in information from Step 2 to prove to Azure that it is allowed to build things on your behalf.</w:t>
-      </w:r>
-    </w:p>
-    <w:p>
-      <w:pPr>
-        <w:pStyle w:val="Heading2"/>
-        <w:spacing w:after="120" w:before="240"/>
-      </w:pPr>
-      <w:r>
-        <w:t xml:space="preserve">Step 4: Make sure everything is actually ready</w:t>
-      </w:r>
-    </w:p>
-    <w:p>
-      <w:pPr>
-        <w:spacing w:after="120"/>
-      </w:pPr>
-      <w:r>
-        <w:t xml:space="preserve">Before moving on, run through this quick checklist in your terminal. If every command below prints something back instead of an error, your prerequisites are complete:</w:t>
+        <w:t xml:space="preserve">wget -O- https://apt.releases.hashicorp.com/gpg | gpg --dearmor | sudo tee /usr/share/keyrings/hashicorp-archive-keyring.gpg</w:t>
       </w:r>
     </w:p>
     <w:p>
@@ -1443,9 +1376,190 @@
           <w:sz w:val="19"/>
           <w:szCs w:val="19"/>
         </w:rPr>
-        <w:t xml:space="preserve">az --version
-az account show
-terraform -version</w:t>
+        <w:t xml:space="preserve">echo "deb [signed-by=/usr/share/keyrings/hashicorp-archive-keyring.gpg] https://apt.releases.hashicorp.com $(lsb_release -cs) main" | sudo tee /etc/apt/sources.list.d/hashicorp.list</w:t>
+      </w:r>
+    </w:p>
+    <w:p>
+      <w:pPr>
+        <w:pBdr>
+          <w:top w:val="single" w:color="CCCCCC" w:sz="4"/>
+          <w:bottom w:val="single" w:color="CCCCCC" w:sz="4"/>
+          <w:left w:val="single" w:color="CCCCCC" w:sz="4"/>
+          <w:right w:val="single" w:color="CCCCCC" w:sz="4"/>
+        </w:pBdr>
+        <w:shd w:fill="F2F2F2" w:val="clear"/>
+        <w:spacing w:after="120"/>
+      </w:pPr>
+      <w:r>
+        <w:rPr>
+          <w:rFonts w:ascii="Consolas" w:cs="Consolas" w:eastAsia="Consolas" w:hAnsi="Consolas"/>
+          <w:sz w:val="19"/>
+          <w:szCs w:val="19"/>
+        </w:rPr>
+        <w:t xml:space="preserve">sudo apt update &amp;&amp; sudo apt install terraform</w:t>
+      </w:r>
+    </w:p>
+    <w:p>
+      <w:pPr>
+        <w:spacing w:after="120"/>
+      </w:pPr>
+      <w:r>
+        <w:t xml:space="preserve">3. Confirm it installed by typing:</w:t>
+      </w:r>
+    </w:p>
+    <w:p>
+      <w:pPr>
+        <w:pBdr>
+          <w:top w:val="single" w:color="CCCCCC" w:sz="4"/>
+          <w:bottom w:val="single" w:color="CCCCCC" w:sz="4"/>
+          <w:left w:val="single" w:color="CCCCCC" w:sz="4"/>
+          <w:right w:val="single" w:color="CCCCCC" w:sz="4"/>
+        </w:pBdr>
+        <w:shd w:fill="F2F2F2" w:val="clear"/>
+        <w:spacing w:after="120"/>
+      </w:pPr>
+      <w:r>
+        <w:rPr>
+          <w:rFonts w:ascii="Consolas" w:cs="Consolas" w:eastAsia="Consolas" w:hAnsi="Consolas"/>
+          <w:sz w:val="19"/>
+          <w:szCs w:val="19"/>
+        </w:rPr>
+        <w:t xml:space="preserve">terraform -version</w:t>
+      </w:r>
+    </w:p>
+    <w:p>
+      <w:pPr>
+        <w:pBdr>
+          <w:top w:val="single" w:color="F0DBA0" w:sz="4"/>
+          <w:left w:val="single" w:color="F0DBA0" w:sz="4"/>
+          <w:right w:val="single" w:color="F0DBA0" w:sz="4"/>
+        </w:pBdr>
+        <w:shd w:fill="FFF6DC" w:val="clear"/>
+        <w:spacing w:after="80"/>
+      </w:pPr>
+      <w:r>
+        <w:rPr>
+          <w:b/>
+          <w:bCs/>
+          <w:color w:val="7A5B00"/>
+          <w:sz w:val="20"/>
+          <w:szCs w:val="20"/>
+        </w:rPr>
+        <w:t xml:space="preserve">What this actually means:</w:t>
+      </w:r>
+    </w:p>
+    <w:p>
+      <w:pPr>
+        <w:pBdr>
+          <w:left w:val="single" w:color="F0DBA0" w:sz="4"/>
+          <w:right w:val="single" w:color="F0DBA0" w:sz="4"/>
+        </w:pBdr>
+        <w:shd w:fill="FFF6DC" w:val="clear"/>
+        <w:spacing w:after="60"/>
+        <w:ind w:left="288"/>
+      </w:pPr>
+      <w:r>
+        <w:rPr>
+          <w:sz w:val="20"/>
+          <w:szCs w:val="20"/>
+        </w:rPr>
+        <w:t xml:space="preserve">• The number that prints after terraform -version needs to say 1.3 or higher. If it shows something older, revisit the install steps above and make sure you grabbed the current download.</w:t>
+      </w:r>
+    </w:p>
+    <w:p>
+      <w:pPr>
+        <w:pBdr>
+          <w:bottom w:val="single" w:color="F0DBA0" w:sz="4"/>
+          <w:left w:val="single" w:color="F0DBA0" w:sz="4"/>
+          <w:right w:val="single" w:color="F0DBA0" w:sz="4"/>
+        </w:pBdr>
+        <w:shd w:fill="FFF6DC" w:val="clear"/>
+        <w:spacing w:after="120"/>
+        <w:ind w:left="288"/>
+      </w:pPr>
+      <w:r>
+        <w:rPr>
+          <w:sz w:val="20"/>
+          <w:szCs w:val="20"/>
+        </w:rPr>
+        <w:t xml:space="preserve">• Terraform itself does not talk to Azure directly. It uses the sign in information from Step 2 to prove to Azure that it is allowed to build things on your behalf.</w:t>
+      </w:r>
+    </w:p>
+    <w:p>
+      <w:pPr>
+        <w:pStyle w:val="Heading2"/>
+        <w:spacing w:after="120" w:before="240"/>
+      </w:pPr>
+      <w:r>
+        <w:t xml:space="preserve">Step 4: Make sure everything is actually ready</w:t>
+      </w:r>
+    </w:p>
+    <w:p>
+      <w:pPr>
+        <w:spacing w:after="120"/>
+      </w:pPr>
+      <w:r>
+        <w:t xml:space="preserve">Before moving on, run through this quick checklist in your terminal. If every command below prints something back instead of an error, your prerequisites are complete:</w:t>
+      </w:r>
+    </w:p>
+    <w:p>
+      <w:pPr>
+        <w:pBdr>
+          <w:top w:val="single" w:color="CCCCCC" w:sz="4"/>
+          <w:bottom w:val="single" w:color="CCCCCC" w:sz="4"/>
+          <w:left w:val="single" w:color="CCCCCC" w:sz="4"/>
+          <w:right w:val="single" w:color="CCCCCC" w:sz="4"/>
+        </w:pBdr>
+        <w:shd w:fill="F2F2F2" w:val="clear"/>
+        <w:spacing w:after="120"/>
+      </w:pPr>
+      <w:r>
+        <w:rPr>
+          <w:rFonts w:ascii="Consolas" w:cs="Consolas" w:eastAsia="Consolas" w:hAnsi="Consolas"/>
+          <w:sz w:val="19"/>
+          <w:szCs w:val="19"/>
+        </w:rPr>
+        <w:t xml:space="preserve">az --version</w:t>
+      </w:r>
+    </w:p>
+    <w:p>
+      <w:pPr>
+        <w:pBdr>
+          <w:top w:val="single" w:color="CCCCCC" w:sz="4"/>
+          <w:bottom w:val="single" w:color="CCCCCC" w:sz="4"/>
+          <w:left w:val="single" w:color="CCCCCC" w:sz="4"/>
+          <w:right w:val="single" w:color="CCCCCC" w:sz="4"/>
+        </w:pBdr>
+        <w:shd w:fill="F2F2F2" w:val="clear"/>
+        <w:spacing w:after="120"/>
+      </w:pPr>
+      <w:r>
+        <w:rPr>
+          <w:rFonts w:ascii="Consolas" w:cs="Consolas" w:eastAsia="Consolas" w:hAnsi="Consolas"/>
+          <w:sz w:val="19"/>
+          <w:szCs w:val="19"/>
+        </w:rPr>
+        <w:t xml:space="preserve">az account show</w:t>
+      </w:r>
+    </w:p>
+    <w:p>
+      <w:pPr>
+        <w:pBdr>
+          <w:top w:val="single" w:color="CCCCCC" w:sz="4"/>
+          <w:bottom w:val="single" w:color="CCCCCC" w:sz="4"/>
+          <w:left w:val="single" w:color="CCCCCC" w:sz="4"/>
+          <w:right w:val="single" w:color="CCCCCC" w:sz="4"/>
+        </w:pBdr>
+        <w:shd w:fill="F2F2F2" w:val="clear"/>
+        <w:spacing w:after="120"/>
+      </w:pPr>
+      <w:r>
+        <w:rPr>
+          <w:rFonts w:ascii="Consolas" w:cs="Consolas" w:eastAsia="Consolas" w:hAnsi="Consolas"/>
+          <w:sz w:val="19"/>
+          <w:szCs w:val="19"/>
+        </w:rPr>
+        <w:t xml:space="preserve">terraform -version</w:t>
       </w:r>
     </w:p>
     <w:p>
@@ -1671,9 +1785,47 @@
           <w:sz w:val="19"/>
           <w:szCs w:val="19"/>
         </w:rPr>
-        <w:t xml:space="preserve">mkdir C:\repos\az-ad-vm
-cd C:\repos\az-ad-vm
-New-Item -ItemType File -Name main.tf, variables.tf, outputs.tf, terraform.tfvars, .gitignore</w:t>
+        <w:t xml:space="preserve">mkdir C:\repos\az-ad-vm</w:t>
+      </w:r>
+    </w:p>
+    <w:p>
+      <w:pPr>
+        <w:pBdr>
+          <w:top w:val="single" w:color="CCCCCC" w:sz="4"/>
+          <w:bottom w:val="single" w:color="CCCCCC" w:sz="4"/>
+          <w:left w:val="single" w:color="CCCCCC" w:sz="4"/>
+          <w:right w:val="single" w:color="CCCCCC" w:sz="4"/>
+        </w:pBdr>
+        <w:shd w:fill="F2F2F2" w:val="clear"/>
+        <w:spacing w:after="120"/>
+      </w:pPr>
+      <w:r>
+        <w:rPr>
+          <w:rFonts w:ascii="Consolas" w:cs="Consolas" w:eastAsia="Consolas" w:hAnsi="Consolas"/>
+          <w:sz w:val="19"/>
+          <w:szCs w:val="19"/>
+        </w:rPr>
+        <w:t xml:space="preserve">cd C:\repos\az-ad-vm</w:t>
+      </w:r>
+    </w:p>
+    <w:p>
+      <w:pPr>
+        <w:pBdr>
+          <w:top w:val="single" w:color="CCCCCC" w:sz="4"/>
+          <w:bottom w:val="single" w:color="CCCCCC" w:sz="4"/>
+          <w:left w:val="single" w:color="CCCCCC" w:sz="4"/>
+          <w:right w:val="single" w:color="CCCCCC" w:sz="4"/>
+        </w:pBdr>
+        <w:shd w:fill="F2F2F2" w:val="clear"/>
+        <w:spacing w:after="120"/>
+      </w:pPr>
+      <w:r>
+        <w:rPr>
+          <w:rFonts w:ascii="Consolas" w:cs="Consolas" w:eastAsia="Consolas" w:hAnsi="Consolas"/>
+          <w:sz w:val="19"/>
+          <w:szCs w:val="19"/>
+        </w:rPr>
+        <w:t xml:space="preserve">New-Item -ItemType File -Name main.tf, variables.tf, outputs.tf, terraform.tfvars, .gitignore</w:t>
       </w:r>
     </w:p>
     <w:p>
@@ -3073,9 +3225,47 @@
           <w:sz w:val="19"/>
           <w:szCs w:val="19"/>
         </w:rPr>
-        <w:t xml:space="preserve">terraform init
-terraform plan
-terraform apply</w:t>
+        <w:t xml:space="preserve">terraform init</w:t>
+      </w:r>
+    </w:p>
+    <w:p>
+      <w:pPr>
+        <w:pBdr>
+          <w:top w:val="single" w:color="CCCCCC" w:sz="4"/>
+          <w:bottom w:val="single" w:color="CCCCCC" w:sz="4"/>
+          <w:left w:val="single" w:color="CCCCCC" w:sz="4"/>
+          <w:right w:val="single" w:color="CCCCCC" w:sz="4"/>
+        </w:pBdr>
+        <w:shd w:fill="F2F2F2" w:val="clear"/>
+        <w:spacing w:after="120"/>
+      </w:pPr>
+      <w:r>
+        <w:rPr>
+          <w:rFonts w:ascii="Consolas" w:cs="Consolas" w:eastAsia="Consolas" w:hAnsi="Consolas"/>
+          <w:sz w:val="19"/>
+          <w:szCs w:val="19"/>
+        </w:rPr>
+        <w:t xml:space="preserve">terraform plan</w:t>
+      </w:r>
+    </w:p>
+    <w:p>
+      <w:pPr>
+        <w:pBdr>
+          <w:top w:val="single" w:color="CCCCCC" w:sz="4"/>
+          <w:bottom w:val="single" w:color="CCCCCC" w:sz="4"/>
+          <w:left w:val="single" w:color="CCCCCC" w:sz="4"/>
+          <w:right w:val="single" w:color="CCCCCC" w:sz="4"/>
+        </w:pBdr>
+        <w:shd w:fill="F2F2F2" w:val="clear"/>
+        <w:spacing w:after="120"/>
+      </w:pPr>
+      <w:r>
+        <w:rPr>
+          <w:rFonts w:ascii="Consolas" w:cs="Consolas" w:eastAsia="Consolas" w:hAnsi="Consolas"/>
+          <w:sz w:val="19"/>
+          <w:szCs w:val="19"/>
+        </w:rPr>
+        <w:t xml:space="preserve">terraform apply</w:t>
       </w:r>
     </w:p>
     <w:p>
@@ -3684,10 +3874,67 @@
           <w:sz w:val="19"/>
           <w:szCs w:val="19"/>
         </w:rPr>
-        <w:t xml:space="preserve">Get-Service NTDS | Select-Object Name, Status
-Get-ADDomain
-Get-ADDomainController -Filter *
-Resolve-DnsName corp.charles.com</w:t>
+        <w:t xml:space="preserve">Get-Service NTDS | Select-Object Name, Status</w:t>
+      </w:r>
+    </w:p>
+    <w:p>
+      <w:pPr>
+        <w:pBdr>
+          <w:top w:val="single" w:color="CCCCCC" w:sz="4"/>
+          <w:bottom w:val="single" w:color="CCCCCC" w:sz="4"/>
+          <w:left w:val="single" w:color="CCCCCC" w:sz="4"/>
+          <w:right w:val="single" w:color="CCCCCC" w:sz="4"/>
+        </w:pBdr>
+        <w:shd w:fill="F2F2F2" w:val="clear"/>
+        <w:spacing w:after="120"/>
+      </w:pPr>
+      <w:r>
+        <w:rPr>
+          <w:rFonts w:ascii="Consolas" w:cs="Consolas" w:eastAsia="Consolas" w:hAnsi="Consolas"/>
+          <w:sz w:val="19"/>
+          <w:szCs w:val="19"/>
+        </w:rPr>
+        <w:t xml:space="preserve">Get-ADDomain</w:t>
+      </w:r>
+    </w:p>
+    <w:p>
+      <w:pPr>
+        <w:pBdr>
+          <w:top w:val="single" w:color="CCCCCC" w:sz="4"/>
+          <w:bottom w:val="single" w:color="CCCCCC" w:sz="4"/>
+          <w:left w:val="single" w:color="CCCCCC" w:sz="4"/>
+          <w:right w:val="single" w:color="CCCCCC" w:sz="4"/>
+        </w:pBdr>
+        <w:shd w:fill="F2F2F2" w:val="clear"/>
+        <w:spacing w:after="120"/>
+      </w:pPr>
+      <w:r>
+        <w:rPr>
+          <w:rFonts w:ascii="Consolas" w:cs="Consolas" w:eastAsia="Consolas" w:hAnsi="Consolas"/>
+          <w:sz w:val="19"/>
+          <w:szCs w:val="19"/>
+        </w:rPr>
+        <w:t xml:space="preserve">Get-ADDomainController -Filter *</w:t>
+      </w:r>
+    </w:p>
+    <w:p>
+      <w:pPr>
+        <w:pBdr>
+          <w:top w:val="single" w:color="CCCCCC" w:sz="4"/>
+          <w:bottom w:val="single" w:color="CCCCCC" w:sz="4"/>
+          <w:left w:val="single" w:color="CCCCCC" w:sz="4"/>
+          <w:right w:val="single" w:color="CCCCCC" w:sz="4"/>
+        </w:pBdr>
+        <w:shd w:fill="F2F2F2" w:val="clear"/>
+        <w:spacing w:after="120"/>
+      </w:pPr>
+      <w:r>
+        <w:rPr>
+          <w:rFonts w:ascii="Consolas" w:cs="Consolas" w:eastAsia="Consolas" w:hAnsi="Consolas"/>
+          <w:sz w:val="19"/>
+          <w:szCs w:val="19"/>
+        </w:rPr>
+        <w:t xml:space="preserve">Resolve-DnsName corp.charles.com</w:t>
       </w:r>
     </w:p>
     <w:p>

</xml_diff>